<commit_message>
Add personal website link to resume
</commit_message>
<xml_diff>
--- a/public/downloads/Jonah_Kwesi_Amponsah_Resume_Final.docx
+++ b/public/downloads/Jonah_Kwesi_Amponsah_Resume_Final.docx
@@ -34,6 +34,14 @@
       <w:r>
         <w:t>Lawrence, KS  •  330-942-8093  •  jonahamponsah@gmail.com</w:t>
       </w:r>
+      <w:r>
+        <w:br/>
+      </w:r>
+      <w:hyperlink r:id="rId10">
+        <w:r>
+          <w:t>jonahamponsah.com</w:t>
+        </w:r>
+      </w:hyperlink>
     </w:p>
     <w:p>
       <w:pPr>

</xml_diff>